<commit_message>
Deployed 6165e2b with MkDocs version: 1.6.1
</commit_message>
<xml_diff>
--- a/Buch Camille Chronicles/Melodies.docx
+++ b/Buch Camille Chronicles/Melodies.docx
@@ -26,33 +26,89 @@
         <w:rPr>
           <w:lang w:val="en-US"/>
         </w:rPr>
-        <w:t xml:space="preserve">Melodies are a short assortment of tones that activate the Soulstice powers between Harmonist and Stice. </w:t>
-      </w:r>
-    </w:p>
-    <w:p>
-      <w:pPr>
-        <w:rPr>
-          <w:lang w:val="en-US"/>
-        </w:rPr>
-      </w:pPr>
-      <w:r>
-        <w:rPr>
-          <w:lang w:val="en-US"/>
-        </w:rPr>
-        <w:t>Is the bond of trust between Harmonist and Stice perfect, then they might play the Melodies with even greater effect and control, their passive senses and abilities even greater thatn before.</w:t>
-      </w:r>
-    </w:p>
-    <w:p>
-      <w:pPr>
-        <w:rPr>
-          <w:lang w:val="en-US"/>
-        </w:rPr>
-      </w:pPr>
-      <w:r>
-        <w:rPr>
-          <w:lang w:val="en-US"/>
-        </w:rPr>
-        <w:t>The Melodies of a specific Soulstice combine into a song that can be added upon in either direction. Though the song does have an end if all Melodies are discovered and learned by a Harmonist and played in the right order right behind each other. Then the Harmonist is truly ascended and can use the song freely to combine powers as they wish as well as gain special specific abilities depending on their Soulstice type.</w:t>
+        <w:t xml:space="preserve">Melodies are a short assortment of tones that activate the </w:t>
+      </w:r>
+      <w:proofErr w:type="spellStart"/>
+      <w:r>
+        <w:rPr>
+          <w:lang w:val="en-US"/>
+        </w:rPr>
+        <w:t>Soulstice</w:t>
+      </w:r>
+      <w:proofErr w:type="spellEnd"/>
+      <w:r>
+        <w:rPr>
+          <w:lang w:val="en-US"/>
+        </w:rPr>
+        <w:t xml:space="preserve"> powers between Harmonist and Stice. </w:t>
+      </w:r>
+    </w:p>
+    <w:p>
+      <w:pPr>
+        <w:rPr>
+          <w:lang w:val="en-US"/>
+        </w:rPr>
+      </w:pPr>
+      <w:r>
+        <w:rPr>
+          <w:lang w:val="en-US"/>
+        </w:rPr>
+        <w:t xml:space="preserve">Is the bond of trust between Harmonist and Stice perfect, then they might play the Melodies with even greater effect and control, their passive senses and abilities even greater </w:t>
+      </w:r>
+      <w:proofErr w:type="spellStart"/>
+      <w:r>
+        <w:rPr>
+          <w:lang w:val="en-US"/>
+        </w:rPr>
+        <w:t>thatn</w:t>
+      </w:r>
+      <w:proofErr w:type="spellEnd"/>
+      <w:r>
+        <w:rPr>
+          <w:lang w:val="en-US"/>
+        </w:rPr>
+        <w:t xml:space="preserve"> before.</w:t>
+      </w:r>
+    </w:p>
+    <w:p>
+      <w:pPr>
+        <w:rPr>
+          <w:lang w:val="en-US"/>
+        </w:rPr>
+      </w:pPr>
+      <w:r>
+        <w:rPr>
+          <w:lang w:val="en-US"/>
+        </w:rPr>
+        <w:t xml:space="preserve">The Melodies of a specific </w:t>
+      </w:r>
+      <w:proofErr w:type="spellStart"/>
+      <w:r>
+        <w:rPr>
+          <w:lang w:val="en-US"/>
+        </w:rPr>
+        <w:t>Soulstice</w:t>
+      </w:r>
+      <w:proofErr w:type="spellEnd"/>
+      <w:r>
+        <w:rPr>
+          <w:lang w:val="en-US"/>
+        </w:rPr>
+        <w:t xml:space="preserve"> combine into a song that can be added upon in either direction. Though the song does have an end if all Melodies are discovered and learned by a Harmonist and played in the right order right behind each other. Then the Harmonist is truly ascended and can use the song freely to combine powers as they wish as well as gain special specific abilities depending on their </w:t>
+      </w:r>
+      <w:proofErr w:type="spellStart"/>
+      <w:r>
+        <w:rPr>
+          <w:lang w:val="en-US"/>
+        </w:rPr>
+        <w:t>Soulstice</w:t>
+      </w:r>
+      <w:proofErr w:type="spellEnd"/>
+      <w:r>
+        <w:rPr>
+          <w:lang w:val="en-US"/>
+        </w:rPr>
+        <w:t xml:space="preserve"> type.</w:t>
       </w:r>
     </w:p>
     <w:p>
@@ -62,31 +118,19 @@
           <w:lang w:val="en-US"/>
         </w:rPr>
       </w:pPr>
-      <w:r>
-        <w:rPr>
-          <w:lang w:val="en-US"/>
-        </w:rPr>
-        <w:t xml:space="preserve">Aikstice </w:t>
-      </w:r>
-    </w:p>
-    <w:p>
-      <w:pPr>
-        <w:pStyle w:val="berschrift3"/>
-        <w:rPr>
-          <w:lang w:val="en-US"/>
-        </w:rPr>
-      </w:pPr>
-      <w:r>
-        <w:rPr>
-          <w:lang w:val="en-US"/>
-        </w:rPr>
-        <w:t>E-chord, Day i</w:t>
-      </w:r>
-      <w:r>
-        <w:rPr>
-          <w:lang w:val="en-US"/>
-        </w:rPr>
-        <w:t>n the Life: Beatles</w:t>
+      <w:proofErr w:type="spellStart"/>
+      <w:r>
+        <w:rPr>
+          <w:lang w:val="en-US"/>
+        </w:rPr>
+        <w:t>Aikstice</w:t>
+      </w:r>
+      <w:proofErr w:type="spellEnd"/>
+      <w:r>
+        <w:rPr>
+          <w:lang w:val="en-US"/>
+        </w:rPr>
+        <w:t xml:space="preserve"> </w:t>
       </w:r>
     </w:p>
     <w:p>
@@ -146,7 +190,21 @@
         <w:rPr>
           <w:lang w:val="en-US"/>
         </w:rPr>
-        <w:t xml:space="preserve">and anything it touches </w:t>
+        <w:t xml:space="preserve">and anything it </w:t>
+      </w:r>
+      <w:proofErr w:type="gramStart"/>
+      <w:r>
+        <w:rPr>
+          <w:lang w:val="en-US"/>
+        </w:rPr>
+        <w:t>touches</w:t>
+      </w:r>
+      <w:proofErr w:type="gramEnd"/>
+      <w:r>
+        <w:rPr>
+          <w:lang w:val="en-US"/>
+        </w:rPr>
+        <w:t xml:space="preserve"> </w:t>
       </w:r>
       <w:r>
         <w:rPr>
@@ -304,40 +362,40 @@
         <w:rPr>
           <w:lang w:val="en-US"/>
         </w:rPr>
+        <w:t>Formidable</w:t>
+      </w:r>
+      <w:r>
+        <w:rPr>
+          <w:lang w:val="en-US"/>
+        </w:rPr>
+        <w:t xml:space="preserve"> (Power)</w:t>
+      </w:r>
+    </w:p>
+    <w:p>
+      <w:pPr>
+        <w:rPr>
+          <w:lang w:val="en-US"/>
+        </w:rPr>
+      </w:pPr>
+      <w:r>
+        <w:rPr>
+          <w:lang w:val="en-US"/>
+        </w:rPr>
+        <w:t>Very similar to Formidable, it increases muscle size and bulk while strengthening bones like steel. Though this is used for raw strength and durability in short brawls.</w:t>
+      </w:r>
+    </w:p>
+    <w:p>
+      <w:pPr>
+        <w:pStyle w:val="berschrift3"/>
+        <w:rPr>
+          <w:lang w:val="en-US"/>
+        </w:rPr>
+      </w:pPr>
+      <w:r>
+        <w:rPr>
+          <w:lang w:val="en-US"/>
+        </w:rPr>
         <w:lastRenderedPageBreak/>
-        <w:t>Formidable</w:t>
-      </w:r>
-      <w:r>
-        <w:rPr>
-          <w:lang w:val="en-US"/>
-        </w:rPr>
-        <w:t xml:space="preserve"> (Power)</w:t>
-      </w:r>
-    </w:p>
-    <w:p>
-      <w:pPr>
-        <w:rPr>
-          <w:lang w:val="en-US"/>
-        </w:rPr>
-      </w:pPr>
-      <w:r>
-        <w:rPr>
-          <w:lang w:val="en-US"/>
-        </w:rPr>
-        <w:t>Very similar to Formidable, it increases muscle size and bulk while strengthening bones like steel. Though this is used for raw strength and durability in short brawls.</w:t>
-      </w:r>
-    </w:p>
-    <w:p>
-      <w:pPr>
-        <w:pStyle w:val="berschrift3"/>
-        <w:rPr>
-          <w:lang w:val="en-US"/>
-        </w:rPr>
-      </w:pPr>
-      <w:r>
-        <w:rPr>
-          <w:lang w:val="en-US"/>
-        </w:rPr>
         <w:t>Sense</w:t>
       </w:r>
     </w:p>
@@ -362,12 +420,14 @@
         </w:rPr>
       </w:pPr>
       <w:bookmarkStart w:id="0" w:name="_Hlk234175724"/>
+      <w:proofErr w:type="spellStart"/>
       <w:r>
         <w:rPr>
           <w:lang w:val="en-US"/>
         </w:rPr>
         <w:t>Kerstice</w:t>
       </w:r>
+      <w:proofErr w:type="spellEnd"/>
     </w:p>
     <w:bookmarkEnd w:id="0"/>
     <w:p>
@@ -396,11 +456,21 @@
           <w:lang w:val="en-US"/>
         </w:rPr>
       </w:pPr>
-      <w:r>
-        <w:rPr>
-          <w:lang w:val="en-US"/>
-        </w:rPr>
-        <w:t>Lets the Harmonist amass and form stone and similar material into shapes of their will</w:t>
+      <w:proofErr w:type="spellStart"/>
+      <w:proofErr w:type="gramStart"/>
+      <w:r>
+        <w:rPr>
+          <w:lang w:val="en-US"/>
+        </w:rPr>
+        <w:t>Lets</w:t>
+      </w:r>
+      <w:proofErr w:type="spellEnd"/>
+      <w:proofErr w:type="gramEnd"/>
+      <w:r>
+        <w:rPr>
+          <w:lang w:val="en-US"/>
+        </w:rPr>
+        <w:t xml:space="preserve"> the Harmonist amass and form stone and similar material into shapes of their will</w:t>
       </w:r>
       <w:r>
         <w:rPr>
@@ -599,12 +669,14 @@
           <w:lang w:val="en-US"/>
         </w:rPr>
       </w:pPr>
+      <w:proofErr w:type="spellStart"/>
       <w:r>
         <w:rPr>
           <w:lang w:val="en-US"/>
         </w:rPr>
         <w:t>Vrastice</w:t>
       </w:r>
+      <w:proofErr w:type="spellEnd"/>
     </w:p>
     <w:p>
       <w:pPr>
@@ -662,11 +734,39 @@
     </w:p>
     <w:p>
       <w:pPr>
+        <w:pStyle w:val="berschrift3"/>
+        <w:rPr>
+          <w:lang w:val="en-US"/>
+        </w:rPr>
+      </w:pPr>
+      <w:r>
+        <w:rPr>
+          <w:lang w:val="en-US"/>
+        </w:rPr>
+        <w:t>Melt</w:t>
+      </w:r>
+    </w:p>
+    <w:p>
+      <w:pPr>
+        <w:rPr>
+          <w:lang w:val="en-US"/>
+        </w:rPr>
+      </w:pPr>
+      <w:r>
+        <w:rPr>
+          <w:lang w:val="en-US"/>
+        </w:rPr>
+        <w:t>Shoots molten Lava from the Harmonists mouth.</w:t>
+      </w:r>
+    </w:p>
+    <w:p>
+      <w:pPr>
         <w:pStyle w:val="berschrift2"/>
         <w:rPr>
           <w:lang w:val="en-US"/>
         </w:rPr>
       </w:pPr>
+      <w:proofErr w:type="spellStart"/>
       <w:r>
         <w:rPr>
           <w:lang w:val="en-US"/>
@@ -674,6 +774,7 @@
         <w:lastRenderedPageBreak/>
         <w:t>Mishstice</w:t>
       </w:r>
+      <w:proofErr w:type="spellEnd"/>
       <w:r>
         <w:rPr>
           <w:lang w:val="en-US"/>
@@ -717,7 +818,19 @@
         <w:rPr>
           <w:lang w:val="en-US"/>
         </w:rPr>
-        <w:t xml:space="preserve"> around something, be it your own body, someone else or something entirely different.</w:t>
+        <w:t xml:space="preserve"> </w:t>
+      </w:r>
+      <w:r>
+        <w:rPr>
+          <w:lang w:val="en-US"/>
+        </w:rPr>
+        <w:t xml:space="preserve">out of tiny bubbles </w:t>
+      </w:r>
+      <w:r>
+        <w:rPr>
+          <w:lang w:val="en-US"/>
+        </w:rPr>
+        <w:t>around something, be it your own body, someone else or something entirely different.</w:t>
       </w:r>
       <w:r>
         <w:rPr>
@@ -762,19 +875,43 @@
         <w:rPr>
           <w:lang w:val="en-US"/>
         </w:rPr>
+        <w:t xml:space="preserve"> out of tiny bubbles</w:t>
+      </w:r>
+      <w:r>
+        <w:rPr>
+          <w:lang w:val="en-US"/>
+        </w:rPr>
         <w:t xml:space="preserve"> that can be forme</w:t>
       </w:r>
       <w:r>
         <w:rPr>
           <w:lang w:val="en-US"/>
         </w:rPr>
-        <w:t>d at</w:t>
-      </w:r>
-      <w:r>
-        <w:rPr>
-          <w:lang w:val="en-US"/>
-        </w:rPr>
-        <w:t xml:space="preserve"> will.</w:t>
+        <w:t xml:space="preserve">d </w:t>
+      </w:r>
+      <w:r>
+        <w:rPr>
+          <w:lang w:val="en-US"/>
+        </w:rPr>
+        <w:t xml:space="preserve">and controlled </w:t>
+      </w:r>
+      <w:r>
+        <w:rPr>
+          <w:lang w:val="en-US"/>
+        </w:rPr>
+        <w:t>at</w:t>
+      </w:r>
+      <w:r>
+        <w:rPr>
+          <w:lang w:val="en-US"/>
+        </w:rPr>
+        <w:t xml:space="preserve"> will</w:t>
+      </w:r>
+      <w:r>
+        <w:rPr>
+          <w:lang w:val="en-US"/>
+        </w:rPr>
+        <w:t>.</w:t>
       </w:r>
     </w:p>
     <w:p>
@@ -811,12 +948,14 @@
           <w:lang w:val="en-US"/>
         </w:rPr>
       </w:pPr>
+      <w:proofErr w:type="spellStart"/>
       <w:r>
         <w:rPr>
           <w:lang w:val="en-US"/>
         </w:rPr>
         <w:t>Tristice</w:t>
       </w:r>
+      <w:proofErr w:type="spellEnd"/>
     </w:p>
     <w:p>
       <w:pPr>
@@ -906,45 +1045,71 @@
           <w:lang w:val="en-US"/>
         </w:rPr>
       </w:pPr>
+      <w:proofErr w:type="spellStart"/>
       <w:r>
         <w:rPr>
           <w:lang w:val="en-US"/>
         </w:rPr>
         <w:t>Vaostice</w:t>
       </w:r>
-    </w:p>
-    <w:p>
-      <w:pPr>
-        <w:pStyle w:val="berschrift3"/>
-        <w:rPr>
-          <w:lang w:val="en-US"/>
-        </w:rPr>
-      </w:pPr>
+      <w:proofErr w:type="spellEnd"/>
+    </w:p>
+    <w:p>
+      <w:pPr>
+        <w:pStyle w:val="berschrift3"/>
+        <w:rPr>
+          <w:lang w:val="en-US"/>
+        </w:rPr>
+      </w:pPr>
+      <w:proofErr w:type="spellStart"/>
       <w:r>
         <w:rPr>
           <w:lang w:val="en-US"/>
         </w:rPr>
         <w:t>Shkarhound</w:t>
       </w:r>
-      <w:r>
-        <w:rPr>
-          <w:lang w:val="en-US"/>
-        </w:rPr>
-        <w:t xml:space="preserve"> (Soulbinder)</w:t>
-      </w:r>
-    </w:p>
-    <w:p>
-      <w:pPr>
-        <w:rPr>
-          <w:lang w:val="en-US"/>
-        </w:rPr>
-      </w:pPr>
-      <w:r>
-        <w:rPr>
-          <w:lang w:val="en-US"/>
-        </w:rPr>
-        <w:t>Transformation into a Shkarhound</w:t>
-      </w:r>
+      <w:proofErr w:type="spellEnd"/>
+      <w:r>
+        <w:rPr>
+          <w:lang w:val="en-US"/>
+        </w:rPr>
+        <w:t xml:space="preserve"> (</w:t>
+      </w:r>
+      <w:proofErr w:type="spellStart"/>
+      <w:r>
+        <w:rPr>
+          <w:lang w:val="en-US"/>
+        </w:rPr>
+        <w:t>Soulbinder</w:t>
+      </w:r>
+      <w:proofErr w:type="spellEnd"/>
+      <w:r>
+        <w:rPr>
+          <w:lang w:val="en-US"/>
+        </w:rPr>
+        <w:t>)</w:t>
+      </w:r>
+    </w:p>
+    <w:p>
+      <w:pPr>
+        <w:rPr>
+          <w:lang w:val="en-US"/>
+        </w:rPr>
+      </w:pPr>
+      <w:r>
+        <w:rPr>
+          <w:lang w:val="en-US"/>
+        </w:rPr>
+        <w:t xml:space="preserve">Transformation into a </w:t>
+      </w:r>
+      <w:proofErr w:type="spellStart"/>
+      <w:r>
+        <w:rPr>
+          <w:lang w:val="en-US"/>
+        </w:rPr>
+        <w:t>Shkarhound</w:t>
+      </w:r>
+      <w:proofErr w:type="spellEnd"/>
     </w:p>
     <w:p>
       <w:pPr>
@@ -1054,6 +1219,7 @@
           <w:lang w:val="en-US"/>
         </w:rPr>
       </w:pPr>
+      <w:proofErr w:type="spellStart"/>
       <w:r>
         <w:rPr>
           <w:lang w:val="en-US"/>
@@ -1061,6 +1227,7 @@
         <w:lastRenderedPageBreak/>
         <w:t>Rustice</w:t>
       </w:r>
+      <w:proofErr w:type="spellEnd"/>
     </w:p>
     <w:p>
       <w:pPr>
@@ -1157,12 +1324,14 @@
           <w:lang w:val="en-US"/>
         </w:rPr>
       </w:pPr>
+      <w:proofErr w:type="spellStart"/>
       <w:r>
         <w:rPr>
           <w:lang w:val="en-US"/>
         </w:rPr>
         <w:t>Tshostice</w:t>
       </w:r>
+      <w:proofErr w:type="spellEnd"/>
     </w:p>
     <w:p>
       <w:pPr>
@@ -1188,8 +1357,16 @@
         <w:rPr>
           <w:lang w:val="en-US"/>
         </w:rPr>
-        <w:t>Shields oneself or another touched person from other Thostice</w:t>
-      </w:r>
+        <w:t xml:space="preserve">Shields oneself or another touched person from other </w:t>
+      </w:r>
+      <w:proofErr w:type="spellStart"/>
+      <w:r>
+        <w:rPr>
+          <w:lang w:val="en-US"/>
+        </w:rPr>
+        <w:t>Thostice</w:t>
+      </w:r>
+      <w:proofErr w:type="spellEnd"/>
     </w:p>
     <w:p>
       <w:pPr>
@@ -1225,12 +1402,14 @@
           <w:lang w:val="en-US"/>
         </w:rPr>
       </w:pPr>
+      <w:proofErr w:type="spellStart"/>
       <w:r>
         <w:rPr>
           <w:lang w:val="en-US"/>
         </w:rPr>
         <w:t>Nelstice</w:t>
       </w:r>
+      <w:proofErr w:type="spellEnd"/>
     </w:p>
     <w:p>
       <w:pPr>
@@ -1315,11 +1494,21 @@
           <w:lang w:val="en-US"/>
         </w:rPr>
       </w:pPr>
-      <w:r>
-        <w:rPr>
-          <w:lang w:val="en-US"/>
-        </w:rPr>
-        <w:t>Lets existing plants grow or make plants fr</w:t>
+      <w:proofErr w:type="spellStart"/>
+      <w:proofErr w:type="gramStart"/>
+      <w:r>
+        <w:rPr>
+          <w:lang w:val="en-US"/>
+        </w:rPr>
+        <w:t>Lets</w:t>
+      </w:r>
+      <w:proofErr w:type="spellEnd"/>
+      <w:proofErr w:type="gramEnd"/>
+      <w:r>
+        <w:rPr>
+          <w:lang w:val="en-US"/>
+        </w:rPr>
+        <w:t xml:space="preserve"> existing plants grow or make plants fr</w:t>
       </w:r>
       <w:r>
         <w:rPr>
@@ -1392,12 +1581,14 @@
           <w:lang w:val="en-US"/>
         </w:rPr>
       </w:pPr>
+      <w:proofErr w:type="spellStart"/>
       <w:r>
         <w:rPr>
           <w:lang w:val="en-US"/>
         </w:rPr>
         <w:t>Shistice</w:t>
       </w:r>
+      <w:proofErr w:type="spellEnd"/>
     </w:p>
     <w:p>
       <w:pPr>
@@ -1507,12 +1698,14 @@
           <w:lang w:val="en-US"/>
         </w:rPr>
       </w:pPr>
+      <w:proofErr w:type="spellStart"/>
       <w:r>
         <w:rPr>
           <w:lang w:val="en-US"/>
         </w:rPr>
         <w:t>Shaikstice</w:t>
       </w:r>
+      <w:proofErr w:type="spellEnd"/>
     </w:p>
     <w:p>
       <w:pPr>

</xml_diff>